<commit_message>
publish student projects (Fall 2026) 2026-09-22 20:33
</commit_message>
<xml_diff>
--- a/Games/unwoven-harmony.docx
+++ b/Games/unwoven-harmony.docx
@@ -2529,13 +2529,28 @@
         <w:rPr>
           <w:b/>
         </w:rPr>
-        <w:t xml:space="preserve">Recommended composition:</w:t>
-      </w:r>
-      <w:r>
-        <w:t xml:space="preserve"> </w:t>
-      </w:r>
-      <w:r>
-        <w:t xml:space="preserve">6 CS + 1 Design + 2 Art (9) — the Chinese-mythology setting, per-element spell VFX, the enemy/boss roster and the cosmetics are a large, VFX-forward art surface, so two artists carry it; a single designer owns the gesture-combat moveset design (Five Elements), the optional-rhythm combo/Qi system, the stage/enemy design and the shop economy (rules: min 1 Design mandated, max 9 total, D+A ≤ 3; see</w:t>
+        <w:t xml:space="preserve">Team composition (set by instructor):</w:t>
+      </w:r>
+      <w:r>
+        <w:t xml:space="preserve"> </w:t>
+      </w:r>
+      <w:r>
+        <w:t xml:space="preserve">6 CS + 1 Design + 1 Art (8) — the Chinese-mythology setting, per-element spell VFX, the enemy/boss roster and the cosmetics are a large,</w:t>
+      </w:r>
+      <w:r>
+        <w:t xml:space="preserve"> </w:t>
+      </w:r>
+      <w:r>
+        <w:rPr>
+          <w:b/>
+        </w:rPr>
+        <w:t xml:space="preserve">VFX-forward</w:t>
+      </w:r>
+      <w:r>
+        <w:t xml:space="preserve"> </w:t>
+      </w:r>
+      <w:r>
+        <w:t xml:space="preserve">art surface, which one artist now carries; a single designer owns the gesture-combat moveset design (Five Elements), the optional-rhythm combo/Qi system, the stage/enemy design and the shop economy (rules: min 1 Design mandated, max 9 total, D+A ≤ 3; see</w:t>
       </w:r>
       <w:r>
         <w:t xml:space="preserve"> </w:t>
@@ -2547,7 +2562,37 @@
         <w:t xml:space="preserve">team-formation.pdf</w:t>
       </w:r>
       <w:r>
-        <w:t xml:space="preserve">). If the moveset/rhythm/economy design outgrows one designer, trade the 2nd artist for a 2nd designer.</w:t>
+        <w:t xml:space="preserve">).</w:t>
+      </w:r>
+      <w:r>
+        <w:t xml:space="preserve"> </w:t>
+      </w:r>
+      <w:r>
+        <w:rPr>
+          <w:b/>
+        </w:rPr>
+        <w:t xml:space="preserve">Art-scope flag:</w:t>
+      </w:r>
+      <w:r>
+        <w:t xml:space="preserve"> </w:t>
+      </w:r>
+      <w:r>
+        <w:t xml:space="preserve">a VFX-forward combat game is a heavy load for a single artist — prioritise the</w:t>
+      </w:r>
+      <w:r>
+        <w:t xml:space="preserve"> </w:t>
+      </w:r>
+      <w:r>
+        <w:rPr>
+          <w:b/>
+        </w:rPr>
+        <w:t xml:space="preserve">per-element spell VFX</w:t>
+      </w:r>
+      <w:r>
+        <w:t xml:space="preserve"> </w:t>
+      </w:r>
+      <w:r>
+        <w:t xml:space="preserve">(the core reward, produced at M2A5) and the character/enemy roster + animation, keep the stage/UI art lean and reusable, and scope the roster/stages hard; if the art volume outgrows one artist, a 2nd artist would help within the D+A ≤ 3 cap.</w:t>
       </w:r>
       <w:r>
         <w:t xml:space="preserve"> </w:t>
@@ -2771,7 +2816,7 @@
         <w:t xml:space="preserve"> </w:t>
       </w:r>
       <w:r>
-        <w:t xml:space="preserve">2 artists justified (mythology setting + per-element VFX + enemy/boss roster)</w:t>
+        <w:t xml:space="preserve">1 artist (prioritise the roster + animation; the Five-Elements VFX language is set in the bible and produced at M2)</w:t>
       </w:r>
     </w:p>
     <w:p>
@@ -2783,7 +2828,7 @@
         <w:pStyle w:val="Compact"/>
       </w:pPr>
       <w:r>
-        <w:t xml:space="preserve">M1A1 ⭐ Art Bible / Proof of Concept (the Chinese-mythology visual direction — palette, the Five-Elements visual language, readability in combat)</w:t>
+        <w:t xml:space="preserve">M1A1 ⭐ Art Bible / Proof of Concept (the Chinese-mythology visual direction — palette, the Five-Elements visual language incl. the per-element spell-effect look, readability in combat)</w:t>
       </w:r>
     </w:p>
     <w:p>
@@ -2807,43 +2852,7 @@
         <w:pStyle w:val="Compact"/>
       </w:pPr>
       <w:r>
-        <w:t xml:space="preserve">M1A3 Environment, Props &amp; VFX Concepts (the stage settings + the per-element spell-effect language)</w:t>
-      </w:r>
-    </w:p>
-    <w:p>
-      <w:pPr>
-        <w:numPr>
-          <w:ilvl w:val="1"/>
-          <w:numId w:val="1022"/>
-        </w:numPr>
-        <w:pStyle w:val="Compact"/>
-      </w:pPr>
-      <w:r>
-        <w:t xml:space="preserve">M1A4 UI Art Concepts &amp; Typography (Qi/combo/timer HUD, element-select, shop)</w:t>
-      </w:r>
-    </w:p>
-    <w:p>
-      <w:pPr>
-        <w:numPr>
-          <w:ilvl w:val="1"/>
-          <w:numId w:val="1022"/>
-        </w:numPr>
-        <w:pStyle w:val="Compact"/>
-      </w:pPr>
-      <w:r>
         <w:t xml:space="preserve">M1A5 Animation Foundations (player casts per element, enemy/boss attacks, finishing-move flourishes)</w:t>
-      </w:r>
-    </w:p>
-    <w:p>
-      <w:pPr>
-        <w:numPr>
-          <w:ilvl w:val="1"/>
-          <w:numId w:val="1022"/>
-        </w:numPr>
-        <w:pStyle w:val="Compact"/>
-      </w:pPr>
-      <w:r>
-        <w:t xml:space="preserve">M1A6 Early Asset Production — Prototype Support</w:t>
       </w:r>
     </w:p>
     <w:p>
@@ -2894,43 +2903,7 @@
         <w:pStyle w:val="Compact"/>
       </w:pPr>
       <w:r>
-        <w:t xml:space="preserve">M2A3 Environment Alive — Ambient Animation &amp; Layering (the mythology stages)</w:t>
-      </w:r>
-    </w:p>
-    <w:p>
-      <w:pPr>
-        <w:numPr>
-          <w:ilvl w:val="1"/>
-          <w:numId w:val="1023"/>
-        </w:numPr>
-        <w:pStyle w:val="Compact"/>
-      </w:pPr>
-      <w:r>
-        <w:t xml:space="preserve">M2A4 UI Art — States &amp; Feedback (on-beat vs off-beat, Qi-full, finishing-move states)</w:t>
-      </w:r>
-    </w:p>
-    <w:p>
-      <w:pPr>
-        <w:numPr>
-          <w:ilvl w:val="1"/>
-          <w:numId w:val="1023"/>
-        </w:numPr>
-        <w:pStyle w:val="Compact"/>
-      </w:pPr>
-      <w:r>
         <w:t xml:space="preserve">M2A5 VFX — Critical Effects &amp; Transitions (per-element spell VFX + the on-beat finishing-move flair — the core reward)</w:t>
-      </w:r>
-    </w:p>
-    <w:p>
-      <w:pPr>
-        <w:numPr>
-          <w:ilvl w:val="1"/>
-          <w:numId w:val="1023"/>
-        </w:numPr>
-        <w:pStyle w:val="Compact"/>
-      </w:pPr>
-      <w:r>
-        <w:t xml:space="preserve">M2A6 Cutscenes &amp; Storyboards (the mythology story beats)</w:t>
       </w:r>
     </w:p>
     <w:p>

</xml_diff>